<commit_message>
fix: table borders, heading fonts, figure indents, TOC alignment
- Add postprocess-docx.py: fixes table borders (full grid), removes
  cell indents, centers figures, fixes Title font after pandoc generation
- Remove theme font overrides from headings (asciiTheme/hAnsiTheme
  were overriding explicit Times New Roman with theme fonts)
- Set TOC styles to LEFT alignment
- Set Figure/Caption styles: no indent, centered
- Add rules: no HR lines in Markdown, no manual numbering
- Update SKILL.md with postprocess step in Phase 4
</commit_message>
<xml_diff>
--- a/skills/gen-docs/templates/reference-lite.docx
+++ b/skills/gen-docs/templates/reference-lite.docx
@@ -719,7 +719,7 @@
       <w:outlineLvl w:val="0"/>
     </w:pPr>
     <w:rPr>
-      <w:rFonts w:asciiTheme="majorHAnsi" w:eastAsiaTheme="majorEastAsia" w:hAnsiTheme="majorHAnsi" w:cstheme="majorBidi" w:ascii="Arial" w:hAnsi="Arial" w:eastAsia="Arial" w:cs="Arial"/>
+      <w:rFonts w:ascii="Arial" w:hAnsi="Arial" w:eastAsia="Arial" w:cs="Arial"/>
       <w:b/>
       <w:sz w:val="32"/>
       <w:szCs w:val="40"/>
@@ -743,7 +743,7 @@
       <w:outlineLvl w:val="1"/>
     </w:pPr>
     <w:rPr>
-      <w:rFonts w:asciiTheme="majorHAnsi" w:eastAsiaTheme="majorEastAsia" w:hAnsiTheme="majorHAnsi" w:cstheme="majorBidi" w:ascii="Arial" w:hAnsi="Arial" w:eastAsia="Arial" w:cs="Arial"/>
+      <w:rFonts w:ascii="Arial" w:hAnsi="Arial" w:eastAsia="Arial" w:cs="Arial"/>
       <w:b/>
       <w:sz w:val="28"/>
       <w:szCs w:val="32"/>
@@ -767,7 +767,7 @@
       <w:outlineLvl w:val="2"/>
     </w:pPr>
     <w:rPr>
-      <w:rFonts w:eastAsiaTheme="majorEastAsia" w:cstheme="majorBidi" w:ascii="Arial" w:hAnsi="Arial" w:eastAsia="Arial" w:cs="Arial"/>
+      <w:rFonts w:ascii="Arial" w:hAnsi="Arial" w:eastAsia="Arial" w:cs="Arial"/>
       <w:b/>
       <w:sz w:val="26"/>
       <w:szCs w:val="28"/>
@@ -791,7 +791,7 @@
       <w:outlineLvl w:val="3"/>
     </w:pPr>
     <w:rPr>
-      <w:rFonts w:eastAsiaTheme="majorEastAsia" w:cstheme="majorBidi" w:ascii="Arial" w:hAnsi="Arial" w:eastAsia="Arial" w:cs="Arial"/>
+      <w:rFonts w:ascii="Arial" w:hAnsi="Arial" w:eastAsia="Arial" w:cs="Arial"/>
       <w:b w:val="0"/>
       <w:i/>
       <w:iCs/>
@@ -1035,7 +1035,7 @@
     <w:qFormat/>
     <w:pPr>
       <w:spacing w:before="100" w:after="100"/>
-      <w:ind w:firstLine="0" w:left="567" w:right="480"/>
+      <w:ind w:left="567" w:right="480"/>
     </w:pPr>
     <w:rPr>
       <w:rFonts w:ascii="Arial" w:hAnsi="Arial" w:eastAsia="Arial" w:cs="Arial"/>
@@ -1074,13 +1074,25 @@
     <w:semiHidden/>
     <w:unhideWhenUsed/>
     <w:qFormat/>
+    <w:rPr>
+      <w:rFonts w:ascii="Arial" w:hAnsi="Arial"/>
+      <w:sz w:val="22"/>
+    </w:rPr>
     <w:tblPr>
       <w:tblInd w:w="0" w:type="dxa"/>
+      <w:tblBorders>
+        <w:top w:val="single" w:sz="4" w:space="0" w:color="000000"/>
+        <w:left w:val="single" w:sz="4" w:space="0" w:color="000000"/>
+        <w:bottom w:val="single" w:sz="4" w:space="0" w:color="000000"/>
+        <w:right w:val="single" w:sz="4" w:space="0" w:color="000000"/>
+        <w:insideH w:val="single" w:sz="4" w:space="0" w:color="000000"/>
+        <w:insideV w:val="single" w:sz="4" w:space="0" w:color="000000"/>
+      </w:tblBorders>
       <w:tblCellMar>
-        <w:top w:w="0" w:type="dxa"/>
-        <w:left w:w="108" w:type="dxa"/>
-        <w:bottom w:w="0" w:type="dxa"/>
-        <w:right w:w="108" w:type="dxa"/>
+        <w:top w:w="28" w:type="dxa"/>
+        <w:left w:w="28" w:type="dxa"/>
+        <w:bottom w:w="28" w:type="dxa"/>
+        <w:right w:w="28" w:type="dxa"/>
       </w:tblCellMar>
     </w:tblPr>
     <w:tblStylePr w:type="firstRow">
@@ -1131,22 +1143,44 @@
     <w:basedOn w:val="Caption"/>
     <w:pPr>
       <w:keepNext/>
-    </w:pPr>
+      <w:jc w:val="left"/>
+    </w:pPr>
+    <w:rPr>
+      <w:rFonts w:ascii="Arial" w:hAnsi="Arial" w:eastAsia="Arial" w:cs="Arial"/>
+      <w:i/>
+      <w:sz w:val="22"/>
+    </w:rPr>
   </w:style>
   <w:style w:type="paragraph" w:customStyle="1" w:styleId="ImageCaption">
     <w:name w:val="Image Caption"/>
     <w:basedOn w:val="Caption"/>
+    <w:pPr>
+      <w:jc w:val="center"/>
+    </w:pPr>
+    <w:rPr>
+      <w:rFonts w:ascii="Arial" w:hAnsi="Arial" w:eastAsia="Arial" w:cs="Arial"/>
+    </w:rPr>
   </w:style>
   <w:style w:type="paragraph" w:customStyle="1" w:styleId="Figure">
     <w:name w:val="Figure"/>
     <w:basedOn w:val="Normal"/>
+    <w:pPr>
+      <w:jc w:val="center"/>
+    </w:pPr>
+    <w:rPr>
+      <w:rFonts w:ascii="Arial" w:hAnsi="Arial" w:eastAsia="Arial" w:cs="Arial"/>
+    </w:rPr>
   </w:style>
   <w:style w:type="paragraph" w:customStyle="1" w:styleId="CaptionedFigure">
     <w:name w:val="Captioned Figure"/>
     <w:basedOn w:val="Figure"/>
     <w:pPr>
       <w:keepNext/>
-    </w:pPr>
+      <w:jc w:val="center"/>
+    </w:pPr>
+    <w:rPr>
+      <w:rFonts w:ascii="Arial" w:hAnsi="Arial" w:eastAsia="Arial" w:cs="Arial"/>
+    </w:rPr>
   </w:style>
   <w:style w:type="character" w:customStyle="1" w:styleId="BodyTextChar">
     <w:name w:val="Body Text Char"/>
@@ -1188,10 +1222,11 @@
     <w:qFormat/>
     <w:pPr>
       <w:spacing w:before="240" w:line="259" w:lineRule="auto"/>
+      <w:jc w:val="left"/>
       <w:outlineLvl w:val="9"/>
     </w:pPr>
     <w:rPr>
-      <w:rFonts w:asciiTheme="majorHAnsi" w:eastAsiaTheme="majorEastAsia" w:hAnsiTheme="majorHAnsi" w:cstheme="majorBidi" w:ascii="Arial" w:hAnsi="Arial" w:eastAsia="Arial" w:cs="Arial"/>
+      <w:rFonts w:ascii="Arial" w:hAnsi="Arial" w:eastAsia="Arial" w:cs="Arial"/>
       <w:b/>
       <w:bCs w:val="0"/>
       <w:color w:val="365F91" w:themeColor="accent1" w:themeShade="BF"/>

</xml_diff>